<commit_message>
Remove leftover "(TTD)" placeholder text from Pernyataan II PML template
Stray label text right above the actual (\${nama_petugas}) signature line -
redundant, just an artifact from the source sample doc.

Co-Authored-By: Claude Sonnet 5 <noreply@anthropic.com>
</commit_message>
<xml_diff>
--- a/static/templates-se2026/surat_pernyataan_termin2_pml_se2026.docx
+++ b/static/templates-se2026/surat_pernyataan_termin2_pml_se2026.docx
@@ -2697,27 +2697,6 @@
                 <w:szCs w:val="24"/>
               </w:rPr>
             </w:pPr>
-          </w:p>
-          <w:p>
-            <w:pPr>
-              <w:spacing w:before="240" w:after="0" w:line="240" w:lineRule="auto"/>
-              <w:jc w:val="center"/>
-              <w:rPr>
-                <w:rFonts w:ascii="Bookman Old Style" w:eastAsia="Bookman Old Style" w:hAnsi="Bookman Old Style" w:cs="Bookman Old Style"/>
-                <w:color w:val="000000"/>
-                <w:sz w:val="24"/>
-                <w:szCs w:val="24"/>
-              </w:rPr>
-            </w:pPr>
-            <w:r>
-              <w:rPr>
-                <w:rFonts w:ascii="Bookman Old Style" w:eastAsia="Bookman Old Style" w:hAnsi="Bookman Old Style" w:cs="Bookman Old Style"/>
-                <w:color w:val="000000"/>
-                <w:sz w:val="24"/>
-                <w:szCs w:val="24"/>
-              </w:rPr>
-              <w:t>(TTD)</w:t>
-            </w:r>
           </w:p>
           <w:p>
             <w:pPr>
@@ -3346,26 +3325,6 @@
           <w:szCs w:val="24"/>
         </w:rPr>
       </w:pPr>
-    </w:p>
-    <w:p>
-      <w:pPr>
-        <w:widowControl w:val="0"/>
-        <w:spacing w:after="0" w:line="276" w:lineRule="auto"/>
-        <w:ind w:left="1800" w:firstLine="8820"/>
-        <w:rPr>
-          <w:rFonts w:ascii="Bookman Old Style" w:eastAsia="Bookman Old Style" w:hAnsi="Bookman Old Style" w:cs="Bookman Old Style"/>
-          <w:sz w:val="24"/>
-          <w:szCs w:val="24"/>
-        </w:rPr>
-      </w:pPr>
-      <w:r>
-        <w:rPr>
-          <w:rFonts w:ascii="Bookman Old Style" w:eastAsia="Bookman Old Style" w:hAnsi="Bookman Old Style" w:cs="Bookman Old Style"/>
-          <w:sz w:val="24"/>
-          <w:szCs w:val="24"/>
-        </w:rPr>
-        <w:t>(TTD)</w:t>
-      </w:r>
     </w:p>
     <w:p>
       <w:pPr>

</xml_diff>